<commit_message>
Fill in student, guide and department details in ITR report
Co-Authored-By: Claude Opus 5.5 <noreply@anthropic.com>
Claude-Session: https://claude.ai/code/session_016vLScbjraxf1C6aGZf2y7D
</commit_message>
<xml_diff>
--- a/docs/ITR_Report/ITR_Report_Yuvaraj_S_Yali_CivilInc.docx
+++ b/docs/ITR_Report/ITR_Report_Yuvaraj_S_Yali_CivilInc.docx
@@ -87,17 +87,7 @@
           <w:sz w:val="22"/>
           <w:szCs w:val="22"/>
         </w:rPr>
-        <w:t xml:space="preserve">Section: </w:t>
-      </w:r>
-      <w:r>
-        <w:rPr>
-          <w:rFonts w:ascii="Times New Roman" w:cs="Times New Roman" w:eastAsia="Times New Roman" w:hAnsi="Times New Roman"/>
-          <w:sz w:val="22"/>
-          <w:szCs w:val="22"/>
-          <w:highlight w:val="yellow"/>
-          <w:highlightCs w:val="yellow"/>
-        </w:rPr>
-        <w:t xml:space="preserve">____</w:t>
+        <w:t xml:space="preserve">Section: CD</w:t>
       </w:r>
     </w:p>
     <w:p>
@@ -113,17 +103,7 @@
           <w:sz w:val="22"/>
           <w:szCs w:val="22"/>
         </w:rPr>
-        <w:t xml:space="preserve">Reg No: </w:t>
-      </w:r>
-      <w:r>
-        <w:rPr>
-          <w:rFonts w:ascii="Times New Roman" w:cs="Times New Roman" w:eastAsia="Times New Roman" w:hAnsi="Times New Roman"/>
-          <w:sz w:val="22"/>
-          <w:szCs w:val="22"/>
-          <w:highlight w:val="yellow"/>
-          <w:highlightCs w:val="yellow"/>
-        </w:rPr>
-        <w:t xml:space="preserve">_________</w:t>
+        <w:t xml:space="preserve">Reg No: 230907440</w:t>
       </w:r>
       <w:r>
         <w:rPr>
@@ -155,17 +135,15 @@
           <w:sz w:val="22"/>
           <w:szCs w:val="22"/>
         </w:rPr>
-        <w:t xml:space="preserve">Roll No: </w:t>
+        <w:t xml:space="preserve">Roll No: 44</w:t>
       </w:r>
       <w:r>
         <w:rPr>
           <w:rFonts w:ascii="Times New Roman" w:cs="Times New Roman" w:eastAsia="Times New Roman" w:hAnsi="Times New Roman"/>
           <w:sz w:val="22"/>
           <w:szCs w:val="22"/>
-          <w:highlight w:val="yellow"/>
-          <w:highlightCs w:val="yellow"/>
-        </w:rPr>
-        <w:t xml:space="preserve">____</w:t>
+        </w:rPr>
+        <w:t xml:space="preserve">	</w:t>
       </w:r>
       <w:r>
         <w:rPr>
@@ -173,25 +151,7 @@
           <w:sz w:val="22"/>
           <w:szCs w:val="22"/>
         </w:rPr>
-        <w:t xml:space="preserve">	</w:t>
-      </w:r>
-      <w:r>
-        <w:rPr>
-          <w:rFonts w:ascii="Times New Roman" w:cs="Times New Roman" w:eastAsia="Times New Roman" w:hAnsi="Times New Roman"/>
-          <w:sz w:val="22"/>
-          <w:szCs w:val="22"/>
-        </w:rPr>
-        <w:t xml:space="preserve">Mobile No: </w:t>
-      </w:r>
-      <w:r>
-        <w:rPr>
-          <w:rFonts w:ascii="Times New Roman" w:cs="Times New Roman" w:eastAsia="Times New Roman" w:hAnsi="Times New Roman"/>
-          <w:sz w:val="22"/>
-          <w:szCs w:val="22"/>
-          <w:highlight w:val="yellow"/>
-          <w:highlightCs w:val="yellow"/>
-        </w:rPr>
-        <w:t xml:space="preserve">+91 __________</w:t>
+        <w:t xml:space="preserve">Mobile No: +91 8310755424</w:t>
       </w:r>
     </w:p>
     <w:p>
@@ -236,7 +196,7 @@
           <w:sz w:val="22"/>
           <w:szCs w:val="22"/>
         </w:rPr>
-        <w:t xml:space="preserve">Guide’s Name: Smt. Kavitha Yogappanavar</w:t>
+        <w:t xml:space="preserve">Internal Guide’s Name: Smt. Kavitha Yogappanavar</w:t>
       </w:r>
       <w:r>
         <w:rPr>
@@ -252,17 +212,7 @@
           <w:sz w:val="22"/>
           <w:szCs w:val="22"/>
         </w:rPr>
-        <w:t xml:space="preserve">Internal Guide’s Name: </w:t>
-      </w:r>
-      <w:r>
-        <w:rPr>
-          <w:rFonts w:ascii="Times New Roman" w:cs="Times New Roman" w:eastAsia="Times New Roman" w:hAnsi="Times New Roman"/>
-          <w:sz w:val="22"/>
-          <w:szCs w:val="22"/>
-          <w:highlight w:val="yellow"/>
-          <w:highlightCs w:val="yellow"/>
-        </w:rPr>
-        <w:t xml:space="preserve">____________</w:t>
+        <w:t xml:space="preserve">College Guide’s Name: Dr. Ananthakrishna T</w:t>
       </w:r>
     </w:p>
     <w:p>
@@ -278,7 +228,7 @@
           <w:sz w:val="22"/>
           <w:szCs w:val="22"/>
         </w:rPr>
-        <w:t xml:space="preserve">Designation: Commissioner, Shivamogga City Corporation</w:t>
+        <w:t xml:space="preserve">Designation: Commissioner – Shimoga City Corporation</w:t>
       </w:r>
       <w:r>
         <w:rPr>
@@ -294,17 +244,7 @@
           <w:sz w:val="22"/>
           <w:szCs w:val="22"/>
         </w:rPr>
-        <w:t xml:space="preserve">Designation: </w:t>
-      </w:r>
-      <w:r>
-        <w:rPr>
-          <w:rFonts w:ascii="Times New Roman" w:cs="Times New Roman" w:eastAsia="Times New Roman" w:hAnsi="Times New Roman"/>
-          <w:sz w:val="22"/>
-          <w:szCs w:val="22"/>
-          <w:highlight w:val="yellow"/>
-          <w:highlightCs w:val="yellow"/>
-        </w:rPr>
-        <w:t xml:space="preserve">____________</w:t>
+        <w:t xml:space="preserve">Department of Electronics and</w:t>
       </w:r>
     </w:p>
     <w:p>
@@ -320,7 +260,7 @@
           <w:sz w:val="22"/>
           <w:szCs w:val="22"/>
         </w:rPr>
-        <w:t xml:space="preserve">&amp; Managing Director, Shivamogga Smart City Ltd.</w:t>
+        <w:t xml:space="preserve">&amp; Managing Director, Shimoga Smart City Ltd.</w:t>
       </w:r>
       <w:r>
         <w:rPr>
@@ -335,10 +275,8 @@
           <w:rFonts w:ascii="Times New Roman" w:cs="Times New Roman" w:eastAsia="Times New Roman" w:hAnsi="Times New Roman"/>
           <w:sz w:val="22"/>
           <w:szCs w:val="22"/>
-          <w:highlight w:val="yellow"/>
-          <w:highlightCs w:val="yellow"/>
-        </w:rPr>
-        <w:t xml:space="preserve">Department</w:t>
+        </w:rPr>
+        <w:t xml:space="preserve">Communication Engineering</w:t>
       </w:r>
     </w:p>
     <w:p>
@@ -434,10 +372,8 @@
           <w:rFonts w:ascii="Times New Roman" w:cs="Times New Roman" w:eastAsia="Times New Roman" w:hAnsi="Times New Roman"/>
           <w:sz w:val="32"/>
           <w:szCs w:val="32"/>
-          <w:highlight w:val="yellow"/>
-          <w:highlightCs w:val="yellow"/>
-        </w:rPr>
-        <w:t xml:space="preserve">School / Department name as required by your programme</w:t>
+        </w:rPr>
+        <w:t xml:space="preserve">Department of Electronics and Communication Engineering</w:t>
       </w:r>
     </w:p>
     <w:p>
@@ -450,10 +386,8 @@
           <w:rFonts w:ascii="Times New Roman" w:cs="Times New Roman" w:eastAsia="Times New Roman" w:hAnsi="Times New Roman"/>
           <w:sz w:val="32"/>
           <w:szCs w:val="32"/>
-          <w:highlight w:val="yellow"/>
-          <w:highlightCs w:val="yellow"/>
-        </w:rPr>
-        <w:t xml:space="preserve">Month Year</w:t>
+        </w:rPr>
+        <w:t xml:space="preserve">2027</w:t>
       </w:r>
     </w:p>
     <w:p>
@@ -1978,25 +1912,25 @@
           <w:sz w:val="24"/>
           <w:szCs w:val="24"/>
         </w:rPr>
-        <w:t xml:space="preserve">I would like to thank my internal guide, </w:t>
-      </w:r>
-      <w:r>
-        <w:rPr>
-          <w:rFonts w:ascii="Times New Roman" w:cs="Times New Roman" w:eastAsia="Times New Roman" w:hAnsi="Times New Roman"/>
-          <w:sz w:val="24"/>
-          <w:szCs w:val="24"/>
-          <w:highlight w:val="yellow"/>
-          <w:highlightCs w:val="yellow"/>
-        </w:rPr>
-        <w:t xml:space="preserve">Name, Designation</w:t>
-      </w:r>
-      <w:r>
-        <w:rPr>
-          <w:rFonts w:ascii="Times New Roman" w:cs="Times New Roman" w:eastAsia="Times New Roman" w:hAnsi="Times New Roman"/>
-          <w:sz w:val="24"/>
-          <w:szCs w:val="24"/>
-        </w:rPr>
-        <w:t xml:space="preserve">, and the faculty of Manipal Institute of Technology for their support and for providing the academic framework within which this training was carried out.</w:t>
+        <w:t xml:space="preserve">I would like to thank my college guide, </w:t>
+      </w:r>
+      <w:r>
+        <w:rPr>
+          <w:rFonts w:ascii="Times New Roman" w:cs="Times New Roman" w:eastAsia="Times New Roman" w:hAnsi="Times New Roman"/>
+          <w:b/>
+          <w:bCs/>
+          <w:sz w:val="24"/>
+          <w:szCs w:val="24"/>
+        </w:rPr>
+        <w:t xml:space="preserve">Dr. Ananthakrishna T</w:t>
+      </w:r>
+      <w:r>
+        <w:rPr>
+          <w:rFonts w:ascii="Times New Roman" w:cs="Times New Roman" w:eastAsia="Times New Roman" w:hAnsi="Times New Roman"/>
+          <w:sz w:val="24"/>
+          <w:szCs w:val="24"/>
+        </w:rPr>
+        <w:t xml:space="preserve">, Department of Electronics and Communication Engineering, and the faculty of Manipal Institute of Technology for their support and for providing the academic framework within which this training was carried out.</w:t>
       </w:r>
     </w:p>
     <w:p>
@@ -13108,7 +13042,7 @@
         </w:rPr>
         <w:t xml:space="preserve">. </w:t>
       </w:r>
-      <w:hyperlink w:history="1" r:id="rIdsho50_oh_qdc0hfktztr_">
+      <w:hyperlink w:history="1" r:id="rIdkfyxe9icys7p7idnk0zsx">
         <w:r>
           <w:rPr>
             <w:rFonts w:ascii="Times New Roman" w:cs="Times New Roman" w:eastAsia="Times New Roman" w:hAnsi="Times New Roman"/>
@@ -13150,7 +13084,7 @@
         </w:rPr>
         <w:t xml:space="preserve">. </w:t>
       </w:r>
-      <w:hyperlink w:history="1" r:id="rIddvsmsifa5r1nhivkbnolr">
+      <w:hyperlink w:history="1" r:id="rIdewd17hijl-bl6qvxscf_8">
         <w:r>
           <w:rPr>
             <w:rFonts w:ascii="Times New Roman" w:cs="Times New Roman" w:eastAsia="Times New Roman" w:hAnsi="Times New Roman"/>
@@ -13192,7 +13126,7 @@
         </w:rPr>
         <w:t xml:space="preserve">. </w:t>
       </w:r>
-      <w:hyperlink w:history="1" r:id="rIdgzu6xqqbmhfrv0_i1hogm">
+      <w:hyperlink w:history="1" r:id="rId21hhgsdscfotx8xsnx7mb">
         <w:r>
           <w:rPr>
             <w:rFonts w:ascii="Times New Roman" w:cs="Times New Roman" w:eastAsia="Times New Roman" w:hAnsi="Times New Roman"/>
@@ -13234,7 +13168,7 @@
         </w:rPr>
         <w:t xml:space="preserve">. </w:t>
       </w:r>
-      <w:hyperlink w:history="1" r:id="rIdva1ml6rkgzd-jzepjq0uo">
+      <w:hyperlink w:history="1" r:id="rIdqxjl3bcpzajknrqrsyqwc">
         <w:r>
           <w:rPr>
             <w:rFonts w:ascii="Times New Roman" w:cs="Times New Roman" w:eastAsia="Times New Roman" w:hAnsi="Times New Roman"/>
@@ -13276,7 +13210,7 @@
         </w:rPr>
         <w:t xml:space="preserve">. </w:t>
       </w:r>
-      <w:hyperlink w:history="1" r:id="rIdgquqljlekliyo6zgyq5qz">
+      <w:hyperlink w:history="1" r:id="rIdmbbzdwdwkgxm8guau4yab">
         <w:r>
           <w:rPr>
             <w:rFonts w:ascii="Times New Roman" w:cs="Times New Roman" w:eastAsia="Times New Roman" w:hAnsi="Times New Roman"/>
@@ -13318,7 +13252,7 @@
         </w:rPr>
         <w:t xml:space="preserve">. </w:t>
       </w:r>
-      <w:hyperlink w:history="1" r:id="rIdjxtijqvtq8y7zv9lmosyb">
+      <w:hyperlink w:history="1" r:id="rId-sge8vs5b9rfamu2o4vxm">
         <w:r>
           <w:rPr>
             <w:rFonts w:ascii="Times New Roman" w:cs="Times New Roman" w:eastAsia="Times New Roman" w:hAnsi="Times New Roman"/>
@@ -13360,7 +13294,7 @@
         </w:rPr>
         <w:t xml:space="preserve">. </w:t>
       </w:r>
-      <w:hyperlink w:history="1" r:id="rIddw-zj9p4drygonbng9bru">
+      <w:hyperlink w:history="1" r:id="rId2os2masms-baqyziyg96u">
         <w:r>
           <w:rPr>
             <w:rFonts w:ascii="Times New Roman" w:cs="Times New Roman" w:eastAsia="Times New Roman" w:hAnsi="Times New Roman"/>
@@ -13402,7 +13336,7 @@
         </w:rPr>
         <w:t xml:space="preserve">. </w:t>
       </w:r>
-      <w:hyperlink w:history="1" r:id="rIdurxtwpfjvdg8xiwhjipuc">
+      <w:hyperlink w:history="1" r:id="rIdi0pyi-namrytgrhfurjg5">
         <w:r>
           <w:rPr>
             <w:rFonts w:ascii="Times New Roman" w:cs="Times New Roman" w:eastAsia="Times New Roman" w:hAnsi="Times New Roman"/>
@@ -13444,7 +13378,7 @@
         </w:rPr>
         <w:t xml:space="preserve">. </w:t>
       </w:r>
-      <w:hyperlink w:history="1" r:id="rIdssjn0u_mtn9emfhtvy2qg">
+      <w:hyperlink w:history="1" r:id="rIdphxrcgpr1pjrn5wwqvb8i">
         <w:r>
           <w:rPr>
             <w:rFonts w:ascii="Times New Roman" w:cs="Times New Roman" w:eastAsia="Times New Roman" w:hAnsi="Times New Roman"/>
@@ -13486,7 +13420,7 @@
         </w:rPr>
         <w:t xml:space="preserve">. </w:t>
       </w:r>
-      <w:hyperlink w:history="1" r:id="rIdkcrowavtw23z_icpbafj3">
+      <w:hyperlink w:history="1" r:id="rIdg1i3vcoupbrx64sbohxkj">
         <w:r>
           <w:rPr>
             <w:rFonts w:ascii="Times New Roman" w:cs="Times New Roman" w:eastAsia="Times New Roman" w:hAnsi="Times New Roman"/>
@@ -13528,7 +13462,7 @@
         </w:rPr>
         <w:t xml:space="preserve">. </w:t>
       </w:r>
-      <w:hyperlink w:history="1" r:id="rIdd6dpgnhjyuqa9ltnkrkyq">
+      <w:hyperlink w:history="1" r:id="rIdczwncd38i1m0jj5qgcymr">
         <w:r>
           <w:rPr>
             <w:rFonts w:ascii="Times New Roman" w:cs="Times New Roman" w:eastAsia="Times New Roman" w:hAnsi="Times New Roman"/>
@@ -13570,7 +13504,7 @@
         </w:rPr>
         <w:t xml:space="preserve">. </w:t>
       </w:r>
-      <w:hyperlink w:history="1" r:id="rIdykenuw4v4v4vi0frfadr8">
+      <w:hyperlink w:history="1" r:id="rIdyxw-sdhj_-lgcoj99fiwm">
         <w:r>
           <w:rPr>
             <w:rFonts w:ascii="Times New Roman" w:cs="Times New Roman" w:eastAsia="Times New Roman" w:hAnsi="Times New Roman"/>
@@ -13612,7 +13546,7 @@
         </w:rPr>
         <w:t xml:space="preserve">. </w:t>
       </w:r>
-      <w:hyperlink w:history="1" r:id="rIdpek83feywbrbwtcqnm6fh">
+      <w:hyperlink w:history="1" r:id="rId3rpmqh8zsq1o1tlfnsnvg">
         <w:r>
           <w:rPr>
             <w:rFonts w:ascii="Times New Roman" w:cs="Times New Roman" w:eastAsia="Times New Roman" w:hAnsi="Times New Roman"/>

</xml_diff>